<commit_message>
Mise à jour du fichier docx
</commit_message>
<xml_diff>
--- a/Mongo db.docx
+++ b/Mongo db.docx
@@ -15087,6 +15087,1568 @@
       <w:r>
         <w:rPr/>
         <w:t>ce qui m’inquite c’est cette conversion en base de données en ligne</w:t>
+      </w:r>
+    </w:p>
+    <w:p>
+      <w:pPr>
+        <w:pStyle w:val="Normal"/>
+        <w:bidi w:val="0"/>
+        <w:jc w:val="start"/>
+        <w:rPr/>
+      </w:pPr>
+      <w:r>
+        <w:rPr/>
+      </w:r>
+    </w:p>
+    <w:p>
+      <w:pPr>
+        <w:pStyle w:val="Normal"/>
+        <w:bidi w:val="0"/>
+        <w:jc w:val="start"/>
+        <w:rPr/>
+      </w:pPr>
+      <w:r>
+        <w:rPr/>
+      </w:r>
+    </w:p>
+    <w:p>
+      <w:pPr>
+        <w:pStyle w:val="Normal"/>
+        <w:bidi w:val="0"/>
+        <w:jc w:val="start"/>
+        <w:rPr/>
+      </w:pPr>
+      <w:r>
+        <w:rPr/>
+      </w:r>
+    </w:p>
+    <w:p>
+      <w:pPr>
+        <w:pStyle w:val="Normal"/>
+        <w:bidi w:val="0"/>
+        <w:jc w:val="start"/>
+        <w:rPr/>
+      </w:pPr>
+      <w:r>
+        <w:rPr/>
+      </w:r>
+    </w:p>
+    <w:p>
+      <w:pPr>
+        <w:pStyle w:val="Normal"/>
+        <w:bidi w:val="0"/>
+        <w:jc w:val="start"/>
+        <w:rPr/>
+      </w:pPr>
+      <w:r>
+        <w:rPr/>
+      </w:r>
+    </w:p>
+    <w:p>
+      <w:pPr>
+        <w:pStyle w:val="Normal"/>
+        <w:bidi w:val="0"/>
+        <w:jc w:val="start"/>
+        <w:rPr/>
+      </w:pPr>
+      <w:r>
+        <w:rPr/>
+      </w:r>
+    </w:p>
+    <w:p>
+      <w:pPr>
+        <w:pStyle w:val="Normal"/>
+        <w:bidi w:val="0"/>
+        <w:jc w:val="start"/>
+        <w:rPr/>
+      </w:pPr>
+      <w:r>
+        <w:rPr/>
+      </w:r>
+    </w:p>
+    <w:p>
+      <w:pPr>
+        <w:pStyle w:val="Normal"/>
+        <w:bidi w:val="0"/>
+        <w:jc w:val="start"/>
+        <w:rPr/>
+      </w:pPr>
+      <w:r>
+        <w:rPr/>
+        <w:t>Structure complet du projet:</w:t>
+      </w:r>
+    </w:p>
+    <w:p>
+      <w:pPr>
+        <w:pStyle w:val="Normal"/>
+        <w:bidi w:val="0"/>
+        <w:jc w:val="start"/>
+        <w:rPr/>
+      </w:pPr>
+      <w:r>
+        <w:rPr/>
+        <w:t>backend/</w:t>
+      </w:r>
+    </w:p>
+    <w:p>
+      <w:pPr>
+        <w:pStyle w:val="Normal"/>
+        <w:bidi w:val="0"/>
+        <w:jc w:val="start"/>
+        <w:rPr/>
+      </w:pPr>
+      <w:r>
+        <w:rPr/>
+        <w:t xml:space="preserve">├── </w:t>
+      </w:r>
+      <w:r>
+        <w:rPr/>
+        <w:t>server.js</w:t>
+      </w:r>
+    </w:p>
+    <w:p>
+      <w:pPr>
+        <w:pStyle w:val="Normal"/>
+        <w:bidi w:val="0"/>
+        <w:jc w:val="start"/>
+        <w:rPr/>
+      </w:pPr>
+      <w:r>
+        <w:rPr/>
+        <w:t xml:space="preserve">├── </w:t>
+      </w:r>
+      <w:r>
+        <w:rPr/>
+        <w:t>package.json</w:t>
+      </w:r>
+    </w:p>
+    <w:p>
+      <w:pPr>
+        <w:pStyle w:val="Normal"/>
+        <w:bidi w:val="0"/>
+        <w:jc w:val="start"/>
+        <w:rPr/>
+      </w:pPr>
+      <w:r>
+        <w:rPr/>
+        <w:t>│</w:t>
+      </w:r>
+    </w:p>
+    <w:p>
+      <w:pPr>
+        <w:pStyle w:val="Normal"/>
+        <w:bidi w:val="0"/>
+        <w:jc w:val="start"/>
+        <w:rPr/>
+      </w:pPr>
+      <w:r>
+        <w:rPr/>
+        <w:t xml:space="preserve">├── </w:t>
+      </w:r>
+      <w:r>
+        <w:rPr/>
+        <w:t>config/</w:t>
+      </w:r>
+    </w:p>
+    <w:p>
+      <w:pPr>
+        <w:pStyle w:val="Normal"/>
+        <w:bidi w:val="0"/>
+        <w:jc w:val="start"/>
+        <w:rPr/>
+      </w:pPr>
+      <w:r>
+        <w:rPr/>
+        <w:t xml:space="preserve">│   ├── </w:t>
+      </w:r>
+      <w:r>
+        <w:rPr/>
+        <w:t>db.js</w:t>
+      </w:r>
+    </w:p>
+    <w:p>
+      <w:pPr>
+        <w:pStyle w:val="Normal"/>
+        <w:bidi w:val="0"/>
+        <w:jc w:val="start"/>
+        <w:rPr/>
+      </w:pPr>
+      <w:r>
+        <w:rPr/>
+        <w:t xml:space="preserve">│   </w:t>
+      </w:r>
+    </w:p>
+    <w:p>
+      <w:pPr>
+        <w:pStyle w:val="Normal"/>
+        <w:bidi w:val="0"/>
+        <w:jc w:val="start"/>
+        <w:rPr/>
+      </w:pPr>
+      <w:r>
+        <w:rPr/>
+        <w:t>│</w:t>
+      </w:r>
+    </w:p>
+    <w:p>
+      <w:pPr>
+        <w:pStyle w:val="Normal"/>
+        <w:bidi w:val="0"/>
+        <w:jc w:val="start"/>
+        <w:rPr/>
+      </w:pPr>
+      <w:r>
+        <w:rPr/>
+        <w:t xml:space="preserve">├── </w:t>
+      </w:r>
+      <w:r>
+        <w:rPr/>
+        <w:t>models/                        ← Schémas MongoDB (= vos "tables")</w:t>
+      </w:r>
+    </w:p>
+    <w:p>
+      <w:pPr>
+        <w:pStyle w:val="Normal"/>
+        <w:bidi w:val="0"/>
+        <w:jc w:val="start"/>
+        <w:rPr/>
+      </w:pPr>
+      <w:r>
+        <w:rPr/>
+        <w:t xml:space="preserve">│   ├── </w:t>
+      </w:r>
+      <w:r>
+        <w:rPr/>
+        <w:t>User.js</w:t>
+      </w:r>
+    </w:p>
+    <w:p>
+      <w:pPr>
+        <w:pStyle w:val="Normal"/>
+        <w:bidi w:val="0"/>
+        <w:jc w:val="start"/>
+        <w:rPr/>
+      </w:pPr>
+      <w:r>
+        <w:rPr/>
+        <w:t xml:space="preserve">│   ├── </w:t>
+      </w:r>
+      <w:r>
+        <w:rPr/>
+        <w:t>Classe.js</w:t>
+      </w:r>
+    </w:p>
+    <w:p>
+      <w:pPr>
+        <w:pStyle w:val="Normal"/>
+        <w:bidi w:val="0"/>
+        <w:jc w:val="start"/>
+        <w:rPr/>
+      </w:pPr>
+      <w:r>
+        <w:rPr/>
+        <w:t xml:space="preserve">│   ├── </w:t>
+      </w:r>
+      <w:r>
+        <w:rPr/>
+        <w:t>Eleve.js</w:t>
+      </w:r>
+    </w:p>
+    <w:p>
+      <w:pPr>
+        <w:pStyle w:val="Normal"/>
+        <w:bidi w:val="0"/>
+        <w:jc w:val="start"/>
+        <w:rPr/>
+      </w:pPr>
+      <w:r>
+        <w:rPr/>
+        <w:t xml:space="preserve">│   └── </w:t>
+      </w:r>
+      <w:r>
+        <w:rPr/>
+        <w:t>Inscription.js</w:t>
+      </w:r>
+    </w:p>
+    <w:p>
+      <w:pPr>
+        <w:pStyle w:val="Normal"/>
+        <w:bidi w:val="0"/>
+        <w:jc w:val="start"/>
+        <w:rPr/>
+      </w:pPr>
+      <w:r>
+        <w:rPr/>
+        <w:t>│</w:t>
+      </w:r>
+    </w:p>
+    <w:p>
+      <w:pPr>
+        <w:pStyle w:val="Normal"/>
+        <w:bidi w:val="0"/>
+        <w:jc w:val="start"/>
+        <w:rPr/>
+      </w:pPr>
+      <w:r>
+        <w:rPr/>
+        <w:t xml:space="preserve">├── </w:t>
+      </w:r>
+      <w:r>
+        <w:rPr/>
+        <w:t>controllers/</w:t>
+      </w:r>
+    </w:p>
+    <w:p>
+      <w:pPr>
+        <w:pStyle w:val="Normal"/>
+        <w:bidi w:val="0"/>
+        <w:jc w:val="start"/>
+        <w:rPr/>
+      </w:pPr>
+      <w:r>
+        <w:rPr/>
+        <w:t xml:space="preserve">│   ├── </w:t>
+      </w:r>
+      <w:r>
+        <w:rPr/>
+        <w:t>authController.js</w:t>
+      </w:r>
+    </w:p>
+    <w:p>
+      <w:pPr>
+        <w:pStyle w:val="Normal"/>
+        <w:bidi w:val="0"/>
+        <w:jc w:val="start"/>
+        <w:rPr/>
+      </w:pPr>
+      <w:r>
+        <w:rPr/>
+        <w:t xml:space="preserve">│   ├── </w:t>
+      </w:r>
+      <w:r>
+        <w:rPr/>
+        <w:t xml:space="preserve">authRoutes.js              </w:t>
+      </w:r>
+    </w:p>
+    <w:p>
+      <w:pPr>
+        <w:pStyle w:val="Normal"/>
+        <w:bidi w:val="0"/>
+        <w:jc w:val="start"/>
+        <w:rPr/>
+      </w:pPr>
+      <w:r>
+        <w:rPr/>
+        <w:t xml:space="preserve">│   ├── </w:t>
+      </w:r>
+      <w:r>
+        <w:rPr/>
+        <w:t>classeController.js</w:t>
+      </w:r>
+    </w:p>
+    <w:p>
+      <w:pPr>
+        <w:pStyle w:val="Normal"/>
+        <w:bidi w:val="0"/>
+        <w:jc w:val="start"/>
+        <w:rPr/>
+      </w:pPr>
+      <w:r>
+        <w:rPr/>
+        <w:t xml:space="preserve">│   ├── </w:t>
+      </w:r>
+      <w:r>
+        <w:rPr/>
+        <w:t>eleveController.js</w:t>
+      </w:r>
+    </w:p>
+    <w:p>
+      <w:pPr>
+        <w:pStyle w:val="Normal"/>
+        <w:bidi w:val="0"/>
+        <w:jc w:val="start"/>
+        <w:rPr/>
+      </w:pPr>
+      <w:r>
+        <w:rPr/>
+        <w:t xml:space="preserve">│   ├── </w:t>
+      </w:r>
+      <w:r>
+        <w:rPr/>
+        <w:t>inscriptionController.js</w:t>
+      </w:r>
+    </w:p>
+    <w:p>
+      <w:pPr>
+        <w:pStyle w:val="Normal"/>
+        <w:bidi w:val="0"/>
+        <w:jc w:val="start"/>
+        <w:rPr/>
+      </w:pPr>
+      <w:r>
+        <w:rPr/>
+        <w:t xml:space="preserve">│   └── </w:t>
+      </w:r>
+      <w:r>
+        <w:rPr/>
+        <w:t>userController.js</w:t>
+      </w:r>
+    </w:p>
+    <w:p>
+      <w:pPr>
+        <w:pStyle w:val="Normal"/>
+        <w:bidi w:val="0"/>
+        <w:jc w:val="start"/>
+        <w:rPr/>
+      </w:pPr>
+      <w:r>
+        <w:rPr/>
+        <w:t>│</w:t>
+      </w:r>
+    </w:p>
+    <w:p>
+      <w:pPr>
+        <w:pStyle w:val="Normal"/>
+        <w:bidi w:val="0"/>
+        <w:jc w:val="start"/>
+        <w:rPr/>
+      </w:pPr>
+      <w:r>
+        <w:rPr/>
+        <w:t xml:space="preserve">├── </w:t>
+      </w:r>
+      <w:r>
+        <w:rPr/>
+        <w:t>middleware/</w:t>
+      </w:r>
+    </w:p>
+    <w:p>
+      <w:pPr>
+        <w:pStyle w:val="Normal"/>
+        <w:bidi w:val="0"/>
+        <w:jc w:val="start"/>
+        <w:rPr/>
+      </w:pPr>
+      <w:r>
+        <w:rPr/>
+        <w:t xml:space="preserve">│   ├── </w:t>
+      </w:r>
+      <w:r>
+        <w:rPr/>
+        <w:t>authMiddleware.js</w:t>
+      </w:r>
+    </w:p>
+    <w:p>
+      <w:pPr>
+        <w:pStyle w:val="Normal"/>
+        <w:bidi w:val="0"/>
+        <w:jc w:val="start"/>
+        <w:rPr/>
+      </w:pPr>
+      <w:r>
+        <w:rPr/>
+        <w:t xml:space="preserve">│   └── </w:t>
+      </w:r>
+      <w:r>
+        <w:rPr/>
+        <w:t>roleMiddleware.js</w:t>
+      </w:r>
+    </w:p>
+    <w:p>
+      <w:pPr>
+        <w:pStyle w:val="Normal"/>
+        <w:bidi w:val="0"/>
+        <w:jc w:val="start"/>
+        <w:rPr/>
+      </w:pPr>
+      <w:r>
+        <w:rPr/>
+        <w:t>│</w:t>
+      </w:r>
+    </w:p>
+    <w:p>
+      <w:pPr>
+        <w:pStyle w:val="Normal"/>
+        <w:bidi w:val="0"/>
+        <w:jc w:val="start"/>
+        <w:rPr/>
+      </w:pPr>
+      <w:r>
+        <w:rPr/>
+        <w:t xml:space="preserve">└── </w:t>
+      </w:r>
+      <w:r>
+        <w:rPr/>
+        <w:t>routes/</w:t>
+      </w:r>
+    </w:p>
+    <w:p>
+      <w:pPr>
+        <w:pStyle w:val="Normal"/>
+        <w:bidi w:val="0"/>
+        <w:jc w:val="start"/>
+        <w:rPr/>
+      </w:pPr>
+      <w:r>
+        <w:rPr/>
+        <w:t xml:space="preserve">    ├── </w:t>
+      </w:r>
+      <w:r>
+        <w:rPr/>
+        <w:t>authRoutes.js</w:t>
+      </w:r>
+    </w:p>
+    <w:p>
+      <w:pPr>
+        <w:pStyle w:val="Normal"/>
+        <w:bidi w:val="0"/>
+        <w:jc w:val="start"/>
+        <w:rPr/>
+      </w:pPr>
+      <w:r>
+        <w:rPr/>
+        <w:t xml:space="preserve">    ├── </w:t>
+      </w:r>
+      <w:r>
+        <w:rPr/>
+        <w:t>classeRoutes.js</w:t>
+      </w:r>
+    </w:p>
+    <w:p>
+      <w:pPr>
+        <w:pStyle w:val="Normal"/>
+        <w:bidi w:val="0"/>
+        <w:jc w:val="start"/>
+        <w:rPr/>
+      </w:pPr>
+      <w:r>
+        <w:rPr/>
+        <w:t xml:space="preserve">    ├── </w:t>
+      </w:r>
+      <w:r>
+        <w:rPr/>
+        <w:t>eleveRoutes.js</w:t>
+      </w:r>
+    </w:p>
+    <w:p>
+      <w:pPr>
+        <w:pStyle w:val="Normal"/>
+        <w:bidi w:val="0"/>
+        <w:jc w:val="start"/>
+        <w:rPr/>
+      </w:pPr>
+      <w:r>
+        <w:rPr/>
+        <w:t xml:space="preserve">    ├── </w:t>
+      </w:r>
+      <w:r>
+        <w:rPr/>
+        <w:t>inscriptionRoutes.js</w:t>
+      </w:r>
+    </w:p>
+    <w:p>
+      <w:pPr>
+        <w:pStyle w:val="Normal"/>
+        <w:bidi w:val="0"/>
+        <w:jc w:val="start"/>
+        <w:rPr/>
+      </w:pPr>
+      <w:r>
+        <w:rPr/>
+        <w:t xml:space="preserve">    ├── </w:t>
+      </w:r>
+      <w:r>
+        <w:rPr/>
+        <w:t>users.js</w:t>
+      </w:r>
+    </w:p>
+    <w:p>
+      <w:pPr>
+        <w:pStyle w:val="Normal"/>
+        <w:bidi w:val="0"/>
+        <w:jc w:val="start"/>
+        <w:rPr/>
+      </w:pPr>
+      <w:r>
+        <w:rPr/>
+      </w:r>
+    </w:p>
+    <w:p>
+      <w:pPr>
+        <w:pStyle w:val="Normal"/>
+        <w:bidi w:val="0"/>
+        <w:jc w:val="start"/>
+        <w:rPr/>
+      </w:pPr>
+      <w:r>
+        <w:rPr/>
+      </w:r>
+    </w:p>
+    <w:p>
+      <w:pPr>
+        <w:pStyle w:val="Normal"/>
+        <w:bidi w:val="0"/>
+        <w:jc w:val="start"/>
+        <w:rPr/>
+      </w:pPr>
+      <w:r>
+        <w:rPr/>
+      </w:r>
+    </w:p>
+    <w:p>
+      <w:pPr>
+        <w:pStyle w:val="Normal"/>
+        <w:bidi w:val="0"/>
+        <w:jc w:val="start"/>
+        <w:rPr/>
+      </w:pPr>
+      <w:r>
+        <w:rPr/>
+        <w:t>src/</w:t>
+      </w:r>
+    </w:p>
+    <w:p>
+      <w:pPr>
+        <w:pStyle w:val="Normal"/>
+        <w:bidi w:val="0"/>
+        <w:jc w:val="start"/>
+        <w:rPr/>
+      </w:pPr>
+      <w:r>
+        <w:rPr/>
+        <w:t xml:space="preserve">├── </w:t>
+      </w:r>
+      <w:r>
+        <w:rPr/>
+        <w:t>index.js</w:t>
+      </w:r>
+    </w:p>
+    <w:p>
+      <w:pPr>
+        <w:pStyle w:val="Normal"/>
+        <w:bidi w:val="0"/>
+        <w:jc w:val="start"/>
+        <w:rPr/>
+      </w:pPr>
+      <w:r>
+        <w:rPr/>
+        <w:t xml:space="preserve">├── </w:t>
+      </w:r>
+      <w:r>
+        <w:rPr/>
+        <w:t>index.css</w:t>
+      </w:r>
+    </w:p>
+    <w:p>
+      <w:pPr>
+        <w:pStyle w:val="Normal"/>
+        <w:bidi w:val="0"/>
+        <w:jc w:val="start"/>
+        <w:rPr/>
+      </w:pPr>
+      <w:r>
+        <w:rPr/>
+        <w:t xml:space="preserve">├── </w:t>
+      </w:r>
+      <w:r>
+        <w:rPr/>
+        <w:t>App.js                        ← Version active</w:t>
+      </w:r>
+    </w:p>
+    <w:p>
+      <w:pPr>
+        <w:pStyle w:val="Normal"/>
+        <w:bidi w:val="0"/>
+        <w:jc w:val="start"/>
+        <w:rPr/>
+      </w:pPr>
+      <w:r>
+        <w:rPr/>
+        <w:t>│</w:t>
+      </w:r>
+    </w:p>
+    <w:p>
+      <w:pPr>
+        <w:pStyle w:val="Normal"/>
+        <w:bidi w:val="0"/>
+        <w:jc w:val="start"/>
+        <w:rPr/>
+      </w:pPr>
+      <w:r>
+        <w:rPr/>
+        <w:t xml:space="preserve">├── </w:t>
+      </w:r>
+      <w:r>
+        <w:rPr/>
+        <w:t>api/                          ← Appels HTTP vers le backend</w:t>
+      </w:r>
+    </w:p>
+    <w:p>
+      <w:pPr>
+        <w:pStyle w:val="Normal"/>
+        <w:bidi w:val="0"/>
+        <w:jc w:val="start"/>
+        <w:rPr/>
+      </w:pPr>
+      <w:r>
+        <w:rPr/>
+        <w:t xml:space="preserve">│   ├── </w:t>
+      </w:r>
+      <w:r>
+        <w:rPr/>
+        <w:t>axios.js</w:t>
+      </w:r>
+    </w:p>
+    <w:p>
+      <w:pPr>
+        <w:pStyle w:val="Normal"/>
+        <w:bidi w:val="0"/>
+        <w:jc w:val="start"/>
+        <w:rPr/>
+      </w:pPr>
+      <w:r>
+        <w:rPr/>
+        <w:t xml:space="preserve">│   ├── </w:t>
+      </w:r>
+      <w:r>
+        <w:rPr/>
+        <w:t>authApi.js</w:t>
+      </w:r>
+    </w:p>
+    <w:p>
+      <w:pPr>
+        <w:pStyle w:val="Normal"/>
+        <w:bidi w:val="0"/>
+        <w:jc w:val="start"/>
+        <w:rPr/>
+      </w:pPr>
+      <w:r>
+        <w:rPr/>
+        <w:t xml:space="preserve">│   ├── </w:t>
+      </w:r>
+      <w:r>
+        <w:rPr/>
+        <w:t>classesApi.js</w:t>
+      </w:r>
+    </w:p>
+    <w:p>
+      <w:pPr>
+        <w:pStyle w:val="Normal"/>
+        <w:bidi w:val="0"/>
+        <w:jc w:val="start"/>
+        <w:rPr/>
+      </w:pPr>
+      <w:r>
+        <w:rPr/>
+        <w:t xml:space="preserve">│   ├── </w:t>
+      </w:r>
+      <w:r>
+        <w:rPr/>
+        <w:t>elevesApi.js</w:t>
+      </w:r>
+    </w:p>
+    <w:p>
+      <w:pPr>
+        <w:pStyle w:val="Normal"/>
+        <w:bidi w:val="0"/>
+        <w:jc w:val="start"/>
+        <w:rPr/>
+      </w:pPr>
+      <w:r>
+        <w:rPr/>
+        <w:t xml:space="preserve">│   ├── </w:t>
+      </w:r>
+      <w:r>
+        <w:rPr/>
+        <w:t>inscriptionsApi.js</w:t>
+      </w:r>
+    </w:p>
+    <w:p>
+      <w:pPr>
+        <w:pStyle w:val="Normal"/>
+        <w:bidi w:val="0"/>
+        <w:jc w:val="start"/>
+        <w:rPr/>
+      </w:pPr>
+      <w:r>
+        <w:rPr/>
+        <w:t xml:space="preserve">│   └── </w:t>
+      </w:r>
+      <w:r>
+        <w:rPr/>
+        <w:t>usersApi.js</w:t>
+      </w:r>
+    </w:p>
+    <w:p>
+      <w:pPr>
+        <w:pStyle w:val="Normal"/>
+        <w:bidi w:val="0"/>
+        <w:jc w:val="start"/>
+        <w:rPr/>
+      </w:pPr>
+      <w:r>
+        <w:rPr/>
+        <w:t>│</w:t>
+      </w:r>
+    </w:p>
+    <w:p>
+      <w:pPr>
+        <w:pStyle w:val="Normal"/>
+        <w:bidi w:val="0"/>
+        <w:jc w:val="start"/>
+        <w:rPr/>
+      </w:pPr>
+      <w:r>
+        <w:rPr/>
+        <w:t xml:space="preserve">├── </w:t>
+      </w:r>
+      <w:r>
+        <w:rPr/>
+        <w:t>context/</w:t>
+      </w:r>
+    </w:p>
+    <w:p>
+      <w:pPr>
+        <w:pStyle w:val="Normal"/>
+        <w:bidi w:val="0"/>
+        <w:jc w:val="start"/>
+        <w:rPr/>
+      </w:pPr>
+      <w:r>
+        <w:rPr/>
+        <w:t xml:space="preserve">│   └── </w:t>
+      </w:r>
+      <w:r>
+        <w:rPr/>
+        <w:t>AuthContext.js            ← Gestion auth globale (JWT)</w:t>
+      </w:r>
+    </w:p>
+    <w:p>
+      <w:pPr>
+        <w:pStyle w:val="Normal"/>
+        <w:bidi w:val="0"/>
+        <w:jc w:val="start"/>
+        <w:rPr/>
+      </w:pPr>
+      <w:r>
+        <w:rPr/>
+        <w:t>│</w:t>
+      </w:r>
+    </w:p>
+    <w:p>
+      <w:pPr>
+        <w:pStyle w:val="Normal"/>
+        <w:bidi w:val="0"/>
+        <w:jc w:val="start"/>
+        <w:rPr/>
+      </w:pPr>
+      <w:r>
+        <w:rPr/>
+        <w:t xml:space="preserve">├── </w:t>
+      </w:r>
+      <w:r>
+        <w:rPr/>
+        <w:t>components/                   ← Composants réutilisables</w:t>
+      </w:r>
+    </w:p>
+    <w:p>
+      <w:pPr>
+        <w:pStyle w:val="Normal"/>
+        <w:bidi w:val="0"/>
+        <w:jc w:val="start"/>
+        <w:rPr/>
+      </w:pPr>
+      <w:r>
+        <w:rPr/>
+        <w:t xml:space="preserve">│   ├── </w:t>
+      </w:r>
+      <w:r>
+        <w:rPr/>
+        <w:t>Header.jsx</w:t>
+      </w:r>
+    </w:p>
+    <w:p>
+      <w:pPr>
+        <w:pStyle w:val="Normal"/>
+        <w:bidi w:val="0"/>
+        <w:jc w:val="start"/>
+        <w:rPr/>
+      </w:pPr>
+      <w:r>
+        <w:rPr/>
+        <w:t xml:space="preserve">│   ├── </w:t>
+      </w:r>
+      <w:r>
+        <w:rPr/>
+        <w:t>Footer.jsx</w:t>
+      </w:r>
+    </w:p>
+    <w:p>
+      <w:pPr>
+        <w:pStyle w:val="Normal"/>
+        <w:bidi w:val="0"/>
+        <w:jc w:val="start"/>
+        <w:rPr/>
+      </w:pPr>
+      <w:r>
+        <w:rPr/>
+        <w:t xml:space="preserve">│   ├── </w:t>
+      </w:r>
+      <w:r>
+        <w:rPr/>
+        <w:t>ClasseForm.jsx</w:t>
+      </w:r>
+    </w:p>
+    <w:p>
+      <w:pPr>
+        <w:pStyle w:val="Normal"/>
+        <w:bidi w:val="0"/>
+        <w:jc w:val="start"/>
+        <w:rPr/>
+      </w:pPr>
+      <w:r>
+        <w:rPr/>
+        <w:t xml:space="preserve">│   ├── </w:t>
+      </w:r>
+      <w:r>
+        <w:rPr/>
+        <w:t>EleveForm.jsx</w:t>
+      </w:r>
+    </w:p>
+    <w:p>
+      <w:pPr>
+        <w:pStyle w:val="Normal"/>
+        <w:bidi w:val="0"/>
+        <w:jc w:val="start"/>
+        <w:rPr/>
+      </w:pPr>
+      <w:r>
+        <w:rPr/>
+        <w:t xml:space="preserve">│   ├── </w:t>
+      </w:r>
+      <w:r>
+        <w:rPr/>
+        <w:t>InscriptionForm.jsx</w:t>
+      </w:r>
+    </w:p>
+    <w:p>
+      <w:pPr>
+        <w:pStyle w:val="Normal"/>
+        <w:bidi w:val="0"/>
+        <w:jc w:val="start"/>
+        <w:rPr/>
+      </w:pPr>
+      <w:r>
+        <w:rPr/>
+        <w:t>│</w:t>
+      </w:r>
+    </w:p>
+    <w:p>
+      <w:pPr>
+        <w:pStyle w:val="Normal"/>
+        <w:bidi w:val="0"/>
+        <w:jc w:val="start"/>
+        <w:rPr/>
+      </w:pPr>
+      <w:r>
+        <w:rPr/>
+        <w:t xml:space="preserve">└── </w:t>
+      </w:r>
+      <w:r>
+        <w:rPr/>
+        <w:t>pages/                        ← Pages de l'application</w:t>
+      </w:r>
+    </w:p>
+    <w:p>
+      <w:pPr>
+        <w:pStyle w:val="Normal"/>
+        <w:bidi w:val="0"/>
+        <w:jc w:val="start"/>
+        <w:rPr/>
+      </w:pPr>
+      <w:r>
+        <w:rPr/>
+        <w:t xml:space="preserve">    ├── </w:t>
+      </w:r>
+      <w:r>
+        <w:rPr/>
+        <w:t xml:space="preserve">Login.jsx             </w:t>
+      </w:r>
+    </w:p>
+    <w:p>
+      <w:pPr>
+        <w:pStyle w:val="Normal"/>
+        <w:bidi w:val="0"/>
+        <w:jc w:val="start"/>
+        <w:rPr/>
+      </w:pPr>
+      <w:r>
+        <w:rPr/>
+        <w:t xml:space="preserve">    ├── </w:t>
+      </w:r>
+      <w:r>
+        <w:rPr/>
+        <w:t xml:space="preserve">Register.jsx             </w:t>
+      </w:r>
+    </w:p>
+    <w:p>
+      <w:pPr>
+        <w:pStyle w:val="Normal"/>
+        <w:bidi w:val="0"/>
+        <w:jc w:val="start"/>
+        <w:rPr/>
+      </w:pPr>
+      <w:r>
+        <w:rPr/>
+        <w:t xml:space="preserve">    ├── </w:t>
+      </w:r>
+      <w:r>
+        <w:rPr/>
+        <w:t xml:space="preserve">RegisterAdmin.jsx         </w:t>
+      </w:r>
+    </w:p>
+    <w:p>
+      <w:pPr>
+        <w:pStyle w:val="Normal"/>
+        <w:bidi w:val="0"/>
+        <w:jc w:val="start"/>
+        <w:rPr/>
+      </w:pPr>
+      <w:r>
+        <w:rPr/>
+        <w:t xml:space="preserve">    │</w:t>
+      </w:r>
+    </w:p>
+    <w:p>
+      <w:pPr>
+        <w:pStyle w:val="Normal"/>
+        <w:bidi w:val="0"/>
+        <w:jc w:val="start"/>
+        <w:rPr/>
+      </w:pPr>
+      <w:r>
+        <w:rPr/>
+        <w:t xml:space="preserve">    ├── </w:t>
+      </w:r>
+      <w:r>
+        <w:rPr/>
+        <w:t xml:space="preserve">DashboardAdmin.jsx        </w:t>
+      </w:r>
+    </w:p>
+    <w:p>
+      <w:pPr>
+        <w:pStyle w:val="Normal"/>
+        <w:bidi w:val="0"/>
+        <w:jc w:val="start"/>
+        <w:rPr/>
+      </w:pPr>
+      <w:r>
+        <w:rPr/>
+        <w:t xml:space="preserve">    ├── </w:t>
+      </w:r>
+      <w:r>
+        <w:rPr/>
+        <w:t xml:space="preserve">DashboardUser.jsx        </w:t>
+      </w:r>
+    </w:p>
+    <w:p>
+      <w:pPr>
+        <w:pStyle w:val="Normal"/>
+        <w:bidi w:val="0"/>
+        <w:jc w:val="start"/>
+        <w:rPr/>
+      </w:pPr>
+      <w:r>
+        <w:rPr/>
+        <w:t xml:space="preserve">    │</w:t>
+      </w:r>
+    </w:p>
+    <w:p>
+      <w:pPr>
+        <w:pStyle w:val="Normal"/>
+        <w:bidi w:val="0"/>
+        <w:jc w:val="start"/>
+        <w:rPr/>
+      </w:pPr>
+      <w:r>
+        <w:rPr/>
+        <w:t xml:space="preserve">    ├── </w:t>
+      </w:r>
+      <w:r>
+        <w:rPr/>
+        <w:t xml:space="preserve">ClassesPage.jsx         </w:t>
+      </w:r>
+    </w:p>
+    <w:p>
+      <w:pPr>
+        <w:pStyle w:val="Normal"/>
+        <w:bidi w:val="0"/>
+        <w:jc w:val="start"/>
+        <w:rPr/>
+      </w:pPr>
+      <w:r>
+        <w:rPr/>
+        <w:t xml:space="preserve">    ├── </w:t>
+      </w:r>
+      <w:r>
+        <w:rPr/>
+        <w:t xml:space="preserve">ElevesPage.jsx          </w:t>
+      </w:r>
+    </w:p>
+    <w:p>
+      <w:pPr>
+        <w:pStyle w:val="Normal"/>
+        <w:bidi w:val="0"/>
+        <w:jc w:val="start"/>
+        <w:rPr/>
+      </w:pPr>
+      <w:r>
+        <w:rPr/>
+        <w:t xml:space="preserve">    ├── </w:t>
+      </w:r>
+      <w:r>
+        <w:rPr/>
+        <w:t xml:space="preserve">InscriptionsPage.jsx     </w:t>
+      </w:r>
+    </w:p>
+    <w:p>
+      <w:pPr>
+        <w:pStyle w:val="Normal"/>
+        <w:bidi w:val="0"/>
+        <w:jc w:val="start"/>
+        <w:rPr/>
+      </w:pPr>
+      <w:r>
+        <w:rPr/>
+        <w:t xml:space="preserve">    ├── </w:t>
+      </w:r>
+      <w:r>
+        <w:rPr/>
+        <w:t xml:space="preserve">UsersPage.jsx             </w:t>
+      </w:r>
+    </w:p>
+    <w:p>
+      <w:pPr>
+        <w:pStyle w:val="Normal"/>
+        <w:bidi w:val="0"/>
+        <w:jc w:val="start"/>
+        <w:rPr/>
+      </w:pPr>
+      <w:r>
+        <w:rPr/>
+        <w:t xml:space="preserve">    │</w:t>
+      </w:r>
+    </w:p>
+    <w:p>
+      <w:pPr>
+        <w:pStyle w:val="Normal"/>
+        <w:bidi w:val="0"/>
+        <w:jc w:val="start"/>
+        <w:rPr/>
+      </w:pPr>
+      <w:r>
+        <w:rPr/>
+        <w:t xml:space="preserve">    ├── </w:t>
+      </w:r>
+      <w:r>
+        <w:rPr/>
+        <w:t>UserClassesList.jsx</w:t>
+      </w:r>
+    </w:p>
+    <w:p>
+      <w:pPr>
+        <w:pStyle w:val="Normal"/>
+        <w:bidi w:val="0"/>
+        <w:jc w:val="start"/>
+        <w:rPr/>
+      </w:pPr>
+      <w:r>
+        <w:rPr/>
+        <w:t xml:space="preserve">    ├── </w:t>
+      </w:r>
+      <w:r>
+        <w:rPr/>
+        <w:t>UserElevesList.jsx</w:t>
+      </w:r>
+    </w:p>
+    <w:p>
+      <w:pPr>
+        <w:pStyle w:val="Normal"/>
+        <w:bidi w:val="0"/>
+        <w:jc w:val="start"/>
+        <w:rPr/>
+      </w:pPr>
+      <w:r>
+        <w:rPr/>
+        <w:t xml:space="preserve">    ├── </w:t>
+      </w:r>
+      <w:r>
+        <w:rPr/>
+        <w:t xml:space="preserve">UserInscriptionsList.jsx </w:t>
+      </w:r>
+    </w:p>
+    <w:p>
+      <w:pPr>
+        <w:pStyle w:val="Normal"/>
+        <w:bidi w:val="0"/>
+        <w:jc w:val="start"/>
+        <w:rPr/>
+      </w:pPr>
+      <w:r>
+        <w:rPr/>
+        <w:t xml:space="preserve">    └── </w:t>
+      </w:r>
+      <w:r>
+        <w:rPr/>
+        <w:t>UserUsersList.jsx</w:t>
+      </w:r>
+    </w:p>
+    <w:p>
+      <w:pPr>
+        <w:pStyle w:val="Normal"/>
+        <w:bidi w:val="0"/>
+        <w:jc w:val="start"/>
+        <w:rPr/>
+      </w:pPr>
+      <w:r>
+        <w:rPr/>
+      </w:r>
+    </w:p>
+    <w:p>
+      <w:pPr>
+        <w:pStyle w:val="Normal"/>
+        <w:bidi w:val="0"/>
+        <w:jc w:val="start"/>
+        <w:rPr/>
+      </w:pPr>
+      <w:r>
+        <w:rPr/>
+      </w:r>
+    </w:p>
+    <w:p>
+      <w:pPr>
+        <w:pStyle w:val="Normal"/>
+        <w:bidi w:val="0"/>
+        <w:jc w:val="start"/>
+        <w:rPr/>
+      </w:pPr>
+      <w:r>
+        <w:rPr/>
+        <w:t>noblette@noblette:~/Documents/Dès Fevrier au Juin/reseau/gestion d'inscription d'une collège$ ls</w:t>
+      </w:r>
+    </w:p>
+    <w:p>
+      <w:pPr>
+        <w:pStyle w:val="Normal"/>
+        <w:bidi w:val="0"/>
+        <w:jc w:val="start"/>
+        <w:rPr/>
+      </w:pPr>
+      <w:r>
+        <w:rPr/>
+        <w:t xml:space="preserve"> </w:t>
+      </w:r>
+      <w:r>
+        <w:rPr/>
+        <w:t>backend   gestion-inscription  'Structure de projet'</w:t>
+      </w:r>
+    </w:p>
+    <w:p>
+      <w:pPr>
+        <w:pStyle w:val="Normal"/>
+        <w:bidi w:val="0"/>
+        <w:jc w:val="start"/>
+        <w:rPr/>
+      </w:pPr>
+      <w:r>
+        <w:rPr/>
+        <w:t>noblette@noblette:~/Documents/Dès Fevrier au Juin/reseau/gestion d'inscription d'une collège$ ls gestion-inscription/</w:t>
+      </w:r>
+    </w:p>
+    <w:p>
+      <w:pPr>
+        <w:pStyle w:val="Normal"/>
+        <w:bidi w:val="0"/>
+        <w:jc w:val="start"/>
+        <w:rPr/>
+      </w:pPr>
+      <w:r>
+        <w:rPr/>
+        <w:t>node_modules  package.json  package-lock.json  postcss.config.js  public  README.md  src  tailwind.config.js</w:t>
+      </w:r>
+    </w:p>
+    <w:p>
+      <w:pPr>
+        <w:pStyle w:val="Normal"/>
+        <w:bidi w:val="0"/>
+        <w:jc w:val="start"/>
+        <w:rPr/>
+      </w:pPr>
+      <w:r>
+        <w:rPr/>
+        <w:t xml:space="preserve">noblette@noblette:~/Documents/Dès Fevrier au Juin/reseau/gestion d'inscription d'une collège$ </w:t>
+      </w:r>
+    </w:p>
+    <w:p>
+      <w:pPr>
+        <w:pStyle w:val="Normal"/>
+        <w:bidi w:val="0"/>
+        <w:jc w:val="start"/>
+        <w:rPr/>
+      </w:pPr>
+      <w:r>
+        <w:rPr/>
+      </w:r>
+    </w:p>
+    <w:p>
+      <w:pPr>
+        <w:pStyle w:val="Normal"/>
+        <w:bidi w:val="0"/>
+        <w:jc w:val="start"/>
+        <w:rPr/>
+      </w:pPr>
+      <w:r>
+        <w:rPr/>
+      </w:r>
+    </w:p>
+    <w:p>
+      <w:pPr>
+        <w:pStyle w:val="Normal"/>
+        <w:bidi w:val="0"/>
+        <w:jc w:val="start"/>
+        <w:rPr/>
+      </w:pPr>
+      <w:r>
+        <w:rPr/>
+        <w:t>ty hoe no anaovana ny déploiement</w:t>
+      </w:r>
+    </w:p>
+    <w:p>
+      <w:pPr>
+        <w:pStyle w:val="Normal"/>
+        <w:bidi w:val="0"/>
+        <w:jc w:val="start"/>
+        <w:rPr/>
+      </w:pPr>
+      <w:r>
+        <w:rPr/>
+        <w:t>gestion d'inscription d'une collège/</w:t>
+      </w:r>
+    </w:p>
+    <w:p>
+      <w:pPr>
+        <w:pStyle w:val="Normal"/>
+        <w:bidi w:val="0"/>
+        <w:jc w:val="start"/>
+        <w:rPr/>
+      </w:pPr>
+      <w:r>
+        <w:rPr/>
+        <w:t>│</w:t>
+      </w:r>
+    </w:p>
+    <w:p>
+      <w:pPr>
+        <w:pStyle w:val="Normal"/>
+        <w:bidi w:val="0"/>
+        <w:jc w:val="start"/>
+        <w:rPr/>
+      </w:pPr>
+      <w:r>
+        <w:rPr/>
+        <w:t xml:space="preserve">├── </w:t>
+      </w:r>
+      <w:r>
+        <w:rPr/>
+        <w:t>backend/</w:t>
+      </w:r>
+    </w:p>
+    <w:p>
+      <w:pPr>
+        <w:pStyle w:val="Normal"/>
+        <w:bidi w:val="0"/>
+        <w:jc w:val="start"/>
+        <w:rPr/>
+      </w:pPr>
+      <w:r>
+        <w:rPr/>
+        <w:t xml:space="preserve">│   ├── </w:t>
+      </w:r>
+      <w:r>
+        <w:rPr/>
+        <w:t>Dockerfile          ← NOUVEAU ici</w:t>
+      </w:r>
+    </w:p>
+    <w:p>
+      <w:pPr>
+        <w:pStyle w:val="Normal"/>
+        <w:bidi w:val="0"/>
+        <w:jc w:val="start"/>
+        <w:rPr/>
+      </w:pPr>
+      <w:r>
+        <w:rPr/>
+        <w:t xml:space="preserve">│   ├── </w:t>
+      </w:r>
+      <w:r>
+        <w:rPr/>
+        <w:t>.dockerignore       ← NOUVEAU ici</w:t>
+      </w:r>
+    </w:p>
+    <w:p>
+      <w:pPr>
+        <w:pStyle w:val="Normal"/>
+        <w:bidi w:val="0"/>
+        <w:jc w:val="start"/>
+        <w:rPr/>
+      </w:pPr>
+      <w:r>
+        <w:rPr/>
+        <w:t xml:space="preserve">│   ├── </w:t>
+      </w:r>
+      <w:r>
+        <w:rPr/>
+        <w:t>server.js</w:t>
+      </w:r>
+    </w:p>
+    <w:p>
+      <w:pPr>
+        <w:pStyle w:val="Normal"/>
+        <w:bidi w:val="0"/>
+        <w:jc w:val="start"/>
+        <w:rPr/>
+      </w:pPr>
+      <w:r>
+        <w:rPr/>
+        <w:t xml:space="preserve">│   ├── </w:t>
+      </w:r>
+      <w:r>
+        <w:rPr/>
+        <w:t>package.json</w:t>
+      </w:r>
+    </w:p>
+    <w:p>
+      <w:pPr>
+        <w:pStyle w:val="Normal"/>
+        <w:bidi w:val="0"/>
+        <w:jc w:val="start"/>
+        <w:rPr/>
+      </w:pPr>
+      <w:r>
+        <w:rPr/>
+        <w:t xml:space="preserve">│   └── </w:t>
+      </w:r>
+      <w:r>
+        <w:rPr/>
+        <w:t>...</w:t>
+      </w:r>
+    </w:p>
+    <w:p>
+      <w:pPr>
+        <w:pStyle w:val="Normal"/>
+        <w:bidi w:val="0"/>
+        <w:jc w:val="start"/>
+        <w:rPr/>
+      </w:pPr>
+      <w:r>
+        <w:rPr/>
+        <w:t>│</w:t>
+      </w:r>
+    </w:p>
+    <w:p>
+      <w:pPr>
+        <w:pStyle w:val="Normal"/>
+        <w:bidi w:val="0"/>
+        <w:jc w:val="start"/>
+        <w:rPr/>
+      </w:pPr>
+      <w:r>
+        <w:rPr/>
+        <w:t xml:space="preserve">└── </w:t>
+      </w:r>
+      <w:r>
+        <w:rPr/>
+        <w:t>gestion-inscription/    ← c'est ton frontend</w:t>
+      </w:r>
+    </w:p>
+    <w:p>
+      <w:pPr>
+        <w:pStyle w:val="Normal"/>
+        <w:bidi w:val="0"/>
+        <w:jc w:val="start"/>
+        <w:rPr/>
+      </w:pPr>
+      <w:r>
+        <w:rPr/>
+        <w:t xml:space="preserve">    ├── </w:t>
+      </w:r>
+      <w:r>
+        <w:rPr/>
+        <w:t>Dockerfile          ← NOUVEAU ici</w:t>
+      </w:r>
+    </w:p>
+    <w:p>
+      <w:pPr>
+        <w:pStyle w:val="Normal"/>
+        <w:bidi w:val="0"/>
+        <w:jc w:val="start"/>
+        <w:rPr/>
+      </w:pPr>
+      <w:r>
+        <w:rPr/>
+        <w:t xml:space="preserve">    ├── </w:t>
+      </w:r>
+      <w:r>
+        <w:rPr/>
+        <w:t>.dockerignore       ← NOUVEAU ici</w:t>
+      </w:r>
+    </w:p>
+    <w:p>
+      <w:pPr>
+        <w:pStyle w:val="Normal"/>
+        <w:bidi w:val="0"/>
+        <w:jc w:val="start"/>
+        <w:rPr/>
+      </w:pPr>
+      <w:r>
+        <w:rPr/>
+        <w:t xml:space="preserve">    ├── </w:t>
+      </w:r>
+      <w:r>
+        <w:rPr/>
+        <w:t>.env.production     ← NOUVEAU ici</w:t>
+      </w:r>
+    </w:p>
+    <w:p>
+      <w:pPr>
+        <w:pStyle w:val="Normal"/>
+        <w:bidi w:val="0"/>
+        <w:jc w:val="start"/>
+        <w:rPr/>
+      </w:pPr>
+      <w:r>
+        <w:rPr/>
+        <w:t xml:space="preserve">    ├── </w:t>
+      </w:r>
+      <w:r>
+        <w:rPr/>
+        <w:t>package.json</w:t>
+      </w:r>
+    </w:p>
+    <w:p>
+      <w:pPr>
+        <w:pStyle w:val="Normal"/>
+        <w:bidi w:val="0"/>
+        <w:jc w:val="start"/>
+        <w:rPr/>
+      </w:pPr>
+      <w:r>
+        <w:rPr/>
+        <w:t xml:space="preserve">    └── </w:t>
+      </w:r>
+      <w:r>
+        <w:rPr/>
+        <w:t>src/</w:t>
       </w:r>
     </w:p>
     <w:sectPr>
@@ -15096,6 +16658,7 @@
       <w:pgNumType w:fmt="decimal"/>
       <w:formProt w:val="false"/>
       <w:textDirection w:val="lrTb"/>
+      <w:docGrid w:type="default" w:linePitch="100" w:charSpace="0"/>
     </w:sectPr>
   </w:body>
 </w:document>
@@ -15115,7 +16678,6 @@
     </w:rPrDefault>
     <w:pPrDefault>
       <w:pPr>
-        <w:widowControl/>
         <w:suppressAutoHyphens w:val="true"/>
       </w:pPr>
     </w:pPrDefault>
@@ -15125,7 +16687,10 @@
     <w:qFormat/>
     <w:pPr>
       <w:widowControl/>
+      <w:suppressAutoHyphens w:val="true"/>
       <w:bidi w:val="0"/>
+      <w:spacing w:before="0" w:after="0"/>
+      <w:jc w:val="start"/>
     </w:pPr>
     <w:rPr>
       <w:rFonts w:ascii="Liberation Serif" w:hAnsi="Liberation Serif" w:eastAsia="Noto Serif CJK SC" w:cs="Noto Sans Devanagari"/>

</xml_diff>